<commit_message>
Release comm_link stack overflow fix v0.2.9
</commit_message>
<xml_diff>
--- a/docs/EyalEspressoDetailedDesign.docx
+++ b/docs/EyalEspressoDetailedDesign.docx
@@ -1,6 +1,6 @@
 
 <file path=word/document.xml><?xml version="1.0" encoding="utf-8"?>
-<w:document xmlns:wpc="http://schemas.microsoft.com/office/word/2010/wordprocessingCanvas" xmlns:mc="http://schemas.openxmlformats.org/markup-compatibility/2006" xmlns:o="urn:schemas-microsoft-com:office:office" xmlns:r="http://schemas.openxmlformats.org/officeDocument/2006/relationships" xmlns:m="http://schemas.openxmlformats.org/officeDocument/2006/math" xmlns:v="urn:schemas-microsoft-com:vml" xmlns:wp14="http://schemas.microsoft.com/office/word/2010/wordprocessingDrawing" xmlns:wp="http://schemas.openxmlformats.org/drawingml/2006/wordprocessingDrawing" xmlns:w10="urn:schemas-microsoft-com:office:word" xmlns:w="http://schemas.openxmlformats.org/wordprocessingml/2006/main" xmlns:w14="http://schemas.microsoft.com/office/word/2010/wordml" xmlns:wpg="http://schemas.microsoft.com/office/word/2010/wordprocessingGroup" xmlns:wpi="http://schemas.microsoft.com/office/word/2010/wordprocessingInk" xmlns:wne="http://schemas.microsoft.com/office/word/2006/wordml" xmlns:wps="http://schemas.microsoft.com/office/word/2010/wordprocessingShape" mc:Ignorable="w14 wp14">
+<w:document xmlns:wpc="http://schemas.microsoft.com/office/word/2010/wordprocessingCanvas" xmlns:mc="http://schemas.openxmlformats.org/markup-compatibility/2006" xmlns:o="urn:schemas-microsoft-com:office:office" xmlns:r="http://schemas.openxmlformats.org/officeDocument/2006/relationships" xmlns:m="http://schemas.openxmlformats.org/officeDocument/2006/math" xmlns:v="urn:schemas-microsoft-com:vml" xmlns:wp14="http://schemas.microsoft.com/office/word/2010/wordprocessingDrawing" xmlns:wp="http://schemas.openxmlformats.org/drawingml/2006/wordprocessingDrawing" xmlns:w10="urn:schemas-microsoft-com:office:word" xmlns:w="http://schemas.openxmlformats.org/wordprocessingml/2006/main" xmlns:w14="http://schemas.microsoft.com/office/word/2010/wordml" xmlns:wpg="http://schemas.microsoft.com/office/word/2010/wordprocessingGroup" xmlns:wpi="http://schemas.microsoft.com/office/word/2010/wordprocessingInk" xmlns:wne="http://schemas.microsoft.com/office/word/2006/wordml" xmlns:wps="http://schemas.microsoft.com/office/word/2010/wordprocessingShape" xmlns:a="http://schemas.openxmlformats.org/drawingml/2006/main" xmlns:pic="http://schemas.openxmlformats.org/drawingml/2006/picture" mc:Ignorable="w14 wp14">
   <w:body>
     <w:p>
       <w:r>
@@ -14,7 +14,7 @@
     </w:p>
     <w:p>
       <w:r>
-        <w:t xml:space="preserve">Project Version Reference: 0.2.6</w:t>
+        <w:t xml:space="preserve">Project Version Reference: 0.2.8</w:t>
       </w:r>
     </w:p>
     <w:p>
@@ -58,6 +58,65 @@
         <w:t xml:space="preserve">Design Rule: high-level workflow, scenario selection, logging, and simulator intelligence stay on the PC host; low-level transport safety and timing enforcement stay on the dedicated ESP32-C3 controller.</w:t>
       </w:r>
     </w:p>
+    <w:p>
+      <w:pPr>
+        <w:jc w:val="center"/>
+      </w:pPr>
+      <w:r>
+        <w:rPr>
+          <w:i/>
+        </w:rPr>
+        <w:t xml:space="preserve">Figure 1. Planned split architecture between the PC simulator, ESP32-C3 transport bridge, and ESP32-S3 client.</w:t>
+      </w:r>
+    </w:p>
+    <w:p>
+      <w:pPr>
+        <w:jc w:val="center"/>
+      </w:pPr>
+      <w:r>
+        <w:drawing>
+          <wp:inline distT="0" distB="0" distL="0" distR="0">
+            <wp:extent cx="5669280" cy="2601199"/>
+            <wp:effectExtent l="0" t="0" r="0" b="0"/>
+            <wp:docPr id="101" name="architecture_transport_split.png"/>
+            <wp:cNvGraphicFramePr>
+              <a:graphicFrameLocks xmlns:a="http://schemas.openxmlformats.org/drawingml/2006/main" noChangeAspect="1"/>
+            </wp:cNvGraphicFramePr>
+            <a:graphic xmlns:a="http://schemas.openxmlformats.org/drawingml/2006/main">
+              <a:graphicData uri="http://schemas.openxmlformats.org/drawingml/2006/picture">
+                <pic:pic xmlns:pic="http://schemas.openxmlformats.org/drawingml/2006/picture">
+                  <pic:nvPicPr>
+                    <pic:cNvPr id="101" name="architecture_transport_split.png"/>
+                    <pic:cNvPicPr/>
+                  </pic:nvPicPr>
+                  <pic:blipFill>
+                    <a:blip r:embed="rId1"/>
+                    <a:stretch>
+                      <a:fillRect/>
+                    </a:stretch>
+                  </pic:blipFill>
+                  <pic:spPr>
+                    <a:xfrm>
+                      <a:off x="0" y="0"/>
+                      <a:ext cx="5669280" cy="2601199"/>
+                    </a:xfrm>
+                    <a:prstGeom prst="rect">
+                      <a:avLst/>
+                    </a:prstGeom>
+                  </pic:spPr>
+                </pic:pic>
+              </a:graphicData>
+            </a:graphic>
+          </wp:inline>
+        </w:drawing>
+      </w:r>
+    </w:p>
+    <w:p/>
+    <w:p>
+      <w:r>
+        <w:t xml:space="preserve">The architecture diagram is normative for responsibility ownership: only the ESP32-C3 bridge owns low-level Wi-Fi/TCP and USB COM transport, while the PC remains the authoritative supervisory host.</w:t>
+      </w:r>
+    </w:p>
     <w:p/>
     <w:p>
       <w:r>
@@ -181,6 +240,60 @@
       </w:r>
     </w:p>
     <w:p>
+      <w:pPr>
+        <w:jc w:val="center"/>
+      </w:pPr>
+      <w:r>
+        <w:rPr>
+          <w:i/>
+        </w:rPr>
+        <w:t xml:space="preserve">Figure 2. Mirrored low-level state machine shared by the host, ESP32-C3 bridge, and client low-level layers.</w:t>
+      </w:r>
+    </w:p>
+    <w:p>
+      <w:pPr>
+        <w:jc w:val="center"/>
+      </w:pPr>
+      <w:r>
+        <w:drawing>
+          <wp:inline distT="0" distB="0" distL="0" distR="0">
+            <wp:extent cx="5669280" cy="3401568"/>
+            <wp:effectExtent l="0" t="0" r="0" b="0"/>
+            <wp:docPr id="102" name="low_level_state_machine.png"/>
+            <wp:cNvGraphicFramePr>
+              <a:graphicFrameLocks xmlns:a="http://schemas.openxmlformats.org/drawingml/2006/main" noChangeAspect="1"/>
+            </wp:cNvGraphicFramePr>
+            <a:graphic xmlns:a="http://schemas.openxmlformats.org/drawingml/2006/main">
+              <a:graphicData uri="http://schemas.openxmlformats.org/drawingml/2006/picture">
+                <pic:pic xmlns:pic="http://schemas.openxmlformats.org/drawingml/2006/picture">
+                  <pic:nvPicPr>
+                    <pic:cNvPr id="102" name="low_level_state_machine.png"/>
+                    <pic:cNvPicPr/>
+                  </pic:nvPicPr>
+                  <pic:blipFill>
+                    <a:blip r:embed="rId2"/>
+                    <a:stretch>
+                      <a:fillRect/>
+                    </a:stretch>
+                  </pic:blipFill>
+                  <pic:spPr>
+                    <a:xfrm>
+                      <a:off x="0" y="0"/>
+                      <a:ext cx="5669280" cy="3401568"/>
+                    </a:xfrm>
+                    <a:prstGeom prst="rect">
+                      <a:avLst/>
+                    </a:prstGeom>
+                  </pic:spPr>
+                </pic:pic>
+              </a:graphicData>
+            </a:graphic>
+          </wp:inline>
+        </w:drawing>
+      </w:r>
+    </w:p>
+    <w:p/>
+    <w:p>
       <w:r>
         <w:t xml:space="preserve">Reset State Responsibilities:</w:t>
       </w:r>
@@ -217,11 +330,21 @@
     </w:p>
     <w:p>
       <w:r>
+        <w:t xml:space="preserve">  - ensure that the Wi-Fi hardware and ESP-IDF driver stack are ready before association work begins</w:t>
+      </w:r>
+    </w:p>
+    <w:p>
+      <w:r>
         <w:t xml:space="preserve">  - prepare Wi-Fi credentials, host/client role, port numbers, and watchdog timing</w:t>
       </w:r>
     </w:p>
     <w:p>
       <w:r>
+        <w:t xml:space="preserve">  - run a visibility precheck scan to confirm that the configured target SSID is actually present before calling esp_wifi_connect()</w:t>
+      </w:r>
+    </w:p>
+    <w:p>
+      <w:r>
         <w:t xml:space="preserve">  - prepare packet parser state without claiming that the link is yet healthy</w:t>
       </w:r>
     </w:p>
@@ -417,6 +540,60 @@
         <w:t xml:space="preserve">  Upper Layer -&gt; if ACK ok then move to initialize else move to error handling</w:t>
       </w:r>
     </w:p>
+    <w:p>
+      <w:pPr>
+        <w:jc w:val="center"/>
+      </w:pPr>
+      <w:r>
+        <w:rPr>
+          <w:i/>
+        </w:rPr>
+        <w:t xml:space="preserve">Figure 3. RESET packet flow from host command through low-level reset acknowledgement.</w:t>
+      </w:r>
+    </w:p>
+    <w:p>
+      <w:pPr>
+        <w:jc w:val="center"/>
+      </w:pPr>
+      <w:r>
+        <w:drawing>
+          <wp:inline distT="0" distB="0" distL="0" distR="0">
+            <wp:extent cx="5669280" cy="1984248"/>
+            <wp:effectExtent l="0" t="0" r="0" b="0"/>
+            <wp:docPr id="103" name="packet_reset_flow.png"/>
+            <wp:cNvGraphicFramePr>
+              <a:graphicFrameLocks xmlns:a="http://schemas.openxmlformats.org/drawingml/2006/main" noChangeAspect="1"/>
+            </wp:cNvGraphicFramePr>
+            <a:graphic xmlns:a="http://schemas.openxmlformats.org/drawingml/2006/main">
+              <a:graphicData uri="http://schemas.openxmlformats.org/drawingml/2006/picture">
+                <pic:pic xmlns:pic="http://schemas.openxmlformats.org/drawingml/2006/picture">
+                  <pic:nvPicPr>
+                    <pic:cNvPr id="103" name="packet_reset_flow.png"/>
+                    <pic:cNvPicPr/>
+                  </pic:nvPicPr>
+                  <pic:blipFill>
+                    <a:blip r:embed="rId3"/>
+                    <a:stretch>
+                      <a:fillRect/>
+                    </a:stretch>
+                  </pic:blipFill>
+                  <pic:spPr>
+                    <a:xfrm>
+                      <a:off x="0" y="0"/>
+                      <a:ext cx="5669280" cy="1984248"/>
+                    </a:xfrm>
+                    <a:prstGeom prst="rect">
+                      <a:avLst/>
+                    </a:prstGeom>
+                  </pic:spPr>
+                </pic:pic>
+              </a:graphicData>
+            </a:graphic>
+          </wp:inline>
+        </w:drawing>
+      </w:r>
+    </w:p>
+    <w:p/>
     <w:p/>
     <w:p>
       <w:r>
@@ -440,7 +617,17 @@
     </w:p>
     <w:p>
       <w:r>
-        <w:t xml:space="preserve">  Low-Level Controller -&gt; validate settings and prepare resources</w:t>
+        <w:t xml:space="preserve">  Low-Level Controller -&gt; validate settings and ensure Wi-Fi hardware stack is ready</w:t>
+      </w:r>
+    </w:p>
+    <w:p>
+      <w:r>
+        <w:t xml:space="preserve">  Low-Level Controller -&gt; run AP visibility precheck for the configured SSID</w:t>
+      </w:r>
+    </w:p>
+    <w:p>
+      <w:r>
+        <w:t xml:space="preserve">  Low-Level Controller -&gt; prepare resources only if the configured SSID is visible</w:t>
       </w:r>
     </w:p>
     <w:p>
@@ -453,6 +640,71 @@
         <w:t xml:space="preserve">  Upper Layer -&gt; if ACK ok then request connect</w:t>
       </w:r>
     </w:p>
+    <w:p>
+      <w:pPr>
+        <w:jc w:val="center"/>
+      </w:pPr>
+      <w:r>
+        <w:rPr>
+          <w:i/>
+        </w:rPr>
+        <w:t xml:space="preserve">Figure 4. INITIALIZE packet flow used to validate and prepare low-level transport resources.</w:t>
+      </w:r>
+    </w:p>
+    <w:p>
+      <w:pPr>
+        <w:jc w:val="center"/>
+      </w:pPr>
+      <w:r>
+        <w:drawing>
+          <wp:inline distT="0" distB="0" distL="0" distR="0">
+            <wp:extent cx="5669280" cy="1984248"/>
+            <wp:effectExtent l="0" t="0" r="0" b="0"/>
+            <wp:docPr id="104" name="packet_initialize_flow.png"/>
+            <wp:cNvGraphicFramePr>
+              <a:graphicFrameLocks xmlns:a="http://schemas.openxmlformats.org/drawingml/2006/main" noChangeAspect="1"/>
+            </wp:cNvGraphicFramePr>
+            <a:graphic xmlns:a="http://schemas.openxmlformats.org/drawingml/2006/main">
+              <a:graphicData uri="http://schemas.openxmlformats.org/drawingml/2006/picture">
+                <pic:pic xmlns:pic="http://schemas.openxmlformats.org/drawingml/2006/picture">
+                  <pic:nvPicPr>
+                    <pic:cNvPr id="104" name="packet_initialize_flow.png"/>
+                    <pic:cNvPicPr/>
+                  </pic:nvPicPr>
+                  <pic:blipFill>
+                    <a:blip r:embed="rId4"/>
+                    <a:stretch>
+                      <a:fillRect/>
+                    </a:stretch>
+                  </pic:blipFill>
+                  <pic:spPr>
+                    <a:xfrm>
+                      <a:off x="0" y="0"/>
+                      <a:ext cx="5669280" cy="1984248"/>
+                    </a:xfrm>
+                    <a:prstGeom prst="rect">
+                      <a:avLst/>
+                    </a:prstGeom>
+                  </pic:spPr>
+                </pic:pic>
+              </a:graphicData>
+            </a:graphic>
+          </wp:inline>
+        </w:drawing>
+      </w:r>
+    </w:p>
+    <w:p/>
+    <w:p/>
+    <w:p>
+      <w:r>
+        <w:t xml:space="preserve">Client-Side Implementation Note:</w:t>
+      </w:r>
+    </w:p>
+    <w:p>
+      <w:r>
+        <w:t xml:space="preserve">  The ESP32-S3 client communication module now performs lazy Wi-Fi hardware initialization through the shared peripheral manager before reset/connect and scan operations. It also performs a blocking SSID visibility precheck so an unavailable AP is reported as a deterministic communication error instead of causing repeated blind association attempts.</w:t>
+      </w:r>
+    </w:p>
     <w:p/>
     <w:p>
       <w:r>
@@ -489,6 +741,60 @@
         <w:t xml:space="preserve">  Both Sides -&gt; begin periodic keep-alive exchange every 100 mSec</w:t>
       </w:r>
     </w:p>
+    <w:p>
+      <w:pPr>
+        <w:jc w:val="center"/>
+      </w:pPr>
+      <w:r>
+        <w:rPr>
+          <w:i/>
+        </w:rPr>
+        <w:t xml:space="preserve">Figure 5. CONNECT packet flow leading into the active 100 mSec keep-alive session.</w:t>
+      </w:r>
+    </w:p>
+    <w:p>
+      <w:pPr>
+        <w:jc w:val="center"/>
+      </w:pPr>
+      <w:r>
+        <w:drawing>
+          <wp:inline distT="0" distB="0" distL="0" distR="0">
+            <wp:extent cx="5669280" cy="1984248"/>
+            <wp:effectExtent l="0" t="0" r="0" b="0"/>
+            <wp:docPr id="105" name="packet_connect_flow.png"/>
+            <wp:cNvGraphicFramePr>
+              <a:graphicFrameLocks xmlns:a="http://schemas.openxmlformats.org/drawingml/2006/main" noChangeAspect="1"/>
+            </wp:cNvGraphicFramePr>
+            <a:graphic xmlns:a="http://schemas.openxmlformats.org/drawingml/2006/main">
+              <a:graphicData uri="http://schemas.openxmlformats.org/drawingml/2006/picture">
+                <pic:pic xmlns:pic="http://schemas.openxmlformats.org/drawingml/2006/picture">
+                  <pic:nvPicPr>
+                    <pic:cNvPr id="105" name="packet_connect_flow.png"/>
+                    <pic:cNvPicPr/>
+                  </pic:nvPicPr>
+                  <pic:blipFill>
+                    <a:blip r:embed="rId5"/>
+                    <a:stretch>
+                      <a:fillRect/>
+                    </a:stretch>
+                  </pic:blipFill>
+                  <pic:spPr>
+                    <a:xfrm>
+                      <a:off x="0" y="0"/>
+                      <a:ext cx="5669280" cy="1984248"/>
+                    </a:xfrm>
+                    <a:prstGeom prst="rect">
+                      <a:avLst/>
+                    </a:prstGeom>
+                  </pic:spPr>
+                </pic:pic>
+              </a:graphicData>
+            </a:graphic>
+          </wp:inline>
+        </w:drawing>
+      </w:r>
+    </w:p>
+    <w:p/>
     <w:p/>
     <w:p>
       <w:r>
@@ -525,6 +831,60 @@
         <w:t xml:space="preserve">  Upper Layer -&gt; return to reset or idle supervisory state</w:t>
       </w:r>
     </w:p>
+    <w:p>
+      <w:pPr>
+        <w:jc w:val="center"/>
+      </w:pPr>
+      <w:r>
+        <w:rPr>
+          <w:i/>
+        </w:rPr>
+        <w:t xml:space="preserve">Figure 6. DISCONNECT packet flow for intentional low-level session teardown.</w:t>
+      </w:r>
+    </w:p>
+    <w:p>
+      <w:pPr>
+        <w:jc w:val="center"/>
+      </w:pPr>
+      <w:r>
+        <w:drawing>
+          <wp:inline distT="0" distB="0" distL="0" distR="0">
+            <wp:extent cx="5669280" cy="1984248"/>
+            <wp:effectExtent l="0" t="0" r="0" b="0"/>
+            <wp:docPr id="106" name="packet_disconnect_flow.png"/>
+            <wp:cNvGraphicFramePr>
+              <a:graphicFrameLocks xmlns:a="http://schemas.openxmlformats.org/drawingml/2006/main" noChangeAspect="1"/>
+            </wp:cNvGraphicFramePr>
+            <a:graphic xmlns:a="http://schemas.openxmlformats.org/drawingml/2006/main">
+              <a:graphicData uri="http://schemas.openxmlformats.org/drawingml/2006/picture">
+                <pic:pic xmlns:pic="http://schemas.openxmlformats.org/drawingml/2006/picture">
+                  <pic:nvPicPr>
+                    <pic:cNvPr id="106" name="packet_disconnect_flow.png"/>
+                    <pic:cNvPicPr/>
+                  </pic:nvPicPr>
+                  <pic:blipFill>
+                    <a:blip r:embed="rId6"/>
+                    <a:stretch>
+                      <a:fillRect/>
+                    </a:stretch>
+                  </pic:blipFill>
+                  <pic:spPr>
+                    <a:xfrm>
+                      <a:off x="0" y="0"/>
+                      <a:ext cx="5669280" cy="1984248"/>
+                    </a:xfrm>
+                    <a:prstGeom prst="rect">
+                      <a:avLst/>
+                    </a:prstGeom>
+                  </pic:spPr>
+                </pic:pic>
+              </a:graphicData>
+            </a:graphic>
+          </wp:inline>
+        </w:drawing>
+      </w:r>
+    </w:p>
+    <w:p/>
     <w:p/>
     <w:p>
       <w:r>
@@ -566,6 +926,60 @@
         <w:t xml:space="preserve">Timeout Rule: if a message is not answered with forward progress of the expected liveness counter within 100 mSec, the low-level controller shall enter error.</w:t>
       </w:r>
     </w:p>
+    <w:p>
+      <w:pPr>
+        <w:jc w:val="center"/>
+      </w:pPr>
+      <w:r>
+        <w:rPr>
+          <w:i/>
+        </w:rPr>
+        <w:t xml:space="preserve">Figure 7. KEEPALIVE packet flow with HostLiveInteger ownership on the PC and status acknowledgement from the bridge.</w:t>
+      </w:r>
+    </w:p>
+    <w:p>
+      <w:pPr>
+        <w:jc w:val="center"/>
+      </w:pPr>
+      <w:r>
+        <w:drawing>
+          <wp:inline distT="0" distB="0" distL="0" distR="0">
+            <wp:extent cx="5669280" cy="1984248"/>
+            <wp:effectExtent l="0" t="0" r="0" b="0"/>
+            <wp:docPr id="107" name="packet_keepalive_flow.png"/>
+            <wp:cNvGraphicFramePr>
+              <a:graphicFrameLocks xmlns:a="http://schemas.openxmlformats.org/drawingml/2006/main" noChangeAspect="1"/>
+            </wp:cNvGraphicFramePr>
+            <a:graphic xmlns:a="http://schemas.openxmlformats.org/drawingml/2006/main">
+              <a:graphicData uri="http://schemas.openxmlformats.org/drawingml/2006/picture">
+                <pic:pic xmlns:pic="http://schemas.openxmlformats.org/drawingml/2006/picture">
+                  <pic:nvPicPr>
+                    <pic:cNvPr id="107" name="packet_keepalive_flow.png"/>
+                    <pic:cNvPicPr/>
+                  </pic:nvPicPr>
+                  <pic:blipFill>
+                    <a:blip r:embed="rId7"/>
+                    <a:stretch>
+                      <a:fillRect/>
+                    </a:stretch>
+                  </pic:blipFill>
+                  <pic:spPr>
+                    <a:xfrm>
+                      <a:off x="0" y="0"/>
+                      <a:ext cx="5669280" cy="1984248"/>
+                    </a:xfrm>
+                    <a:prstGeom prst="rect">
+                      <a:avLst/>
+                    </a:prstGeom>
+                  </pic:spPr>
+                </pic:pic>
+              </a:graphicData>
+            </a:graphic>
+          </wp:inline>
+        </w:drawing>
+      </w:r>
+    </w:p>
+    <w:p/>
     <w:p/>
     <w:p>
       <w:r>
@@ -607,6 +1021,60 @@
         <w:t xml:space="preserve">  Upper Layer -&gt; consume payload only after low-level validation</w:t>
       </w:r>
     </w:p>
+    <w:p>
+      <w:pPr>
+        <w:jc w:val="center"/>
+      </w:pPr>
+      <w:r>
+        <w:rPr>
+          <w:i/>
+        </w:rPr>
+        <w:t xml:space="preserve">Figure 8. DATA packet flow showing low-level validation before application payload handling.</w:t>
+      </w:r>
+    </w:p>
+    <w:p>
+      <w:pPr>
+        <w:jc w:val="center"/>
+      </w:pPr>
+      <w:r>
+        <w:drawing>
+          <wp:inline distT="0" distB="0" distL="0" distR="0">
+            <wp:extent cx="5669280" cy="1984248"/>
+            <wp:effectExtent l="0" t="0" r="0" b="0"/>
+            <wp:docPr id="108" name="packet_data_flow.png"/>
+            <wp:cNvGraphicFramePr>
+              <a:graphicFrameLocks xmlns:a="http://schemas.openxmlformats.org/drawingml/2006/main" noChangeAspect="1"/>
+            </wp:cNvGraphicFramePr>
+            <a:graphic xmlns:a="http://schemas.openxmlformats.org/drawingml/2006/main">
+              <a:graphicData uri="http://schemas.openxmlformats.org/drawingml/2006/picture">
+                <pic:pic xmlns:pic="http://schemas.openxmlformats.org/drawingml/2006/picture">
+                  <pic:nvPicPr>
+                    <pic:cNvPr id="108" name="packet_data_flow.png"/>
+                    <pic:cNvPicPr/>
+                  </pic:nvPicPr>
+                  <pic:blipFill>
+                    <a:blip r:embed="rId8"/>
+                    <a:stretch>
+                      <a:fillRect/>
+                    </a:stretch>
+                  </pic:blipFill>
+                  <pic:spPr>
+                    <a:xfrm>
+                      <a:off x="0" y="0"/>
+                      <a:ext cx="5669280" cy="1984248"/>
+                    </a:xfrm>
+                    <a:prstGeom prst="rect">
+                      <a:avLst/>
+                    </a:prstGeom>
+                  </pic:spPr>
+                </pic:pic>
+              </a:graphicData>
+            </a:graphic>
+          </wp:inline>
+        </w:drawing>
+      </w:r>
+    </w:p>
+    <w:p/>
     <w:p/>
     <w:p>
       <w:r>
@@ -643,6 +1111,60 @@
         <w:t xml:space="preserve">  Low-Level Controller remains in error until explicit recovery command</w:t>
       </w:r>
     </w:p>
+    <w:p>
+      <w:pPr>
+        <w:jc w:val="center"/>
+      </w:pPr>
+      <w:r>
+        <w:rPr>
+          <w:i/>
+        </w:rPr>
+        <w:t xml:space="preserve">Figure 9. ERROR packet flow used to preserve fault context and drive explicit recovery.</w:t>
+      </w:r>
+    </w:p>
+    <w:p>
+      <w:pPr>
+        <w:jc w:val="center"/>
+      </w:pPr>
+      <w:r>
+        <w:drawing>
+          <wp:inline distT="0" distB="0" distL="0" distR="0">
+            <wp:extent cx="5669280" cy="1984248"/>
+            <wp:effectExtent l="0" t="0" r="0" b="0"/>
+            <wp:docPr id="109" name="packet_error_flow.png"/>
+            <wp:cNvGraphicFramePr>
+              <a:graphicFrameLocks xmlns:a="http://schemas.openxmlformats.org/drawingml/2006/main" noChangeAspect="1"/>
+            </wp:cNvGraphicFramePr>
+            <a:graphic xmlns:a="http://schemas.openxmlformats.org/drawingml/2006/main">
+              <a:graphicData uri="http://schemas.openxmlformats.org/drawingml/2006/picture">
+                <pic:pic xmlns:pic="http://schemas.openxmlformats.org/drawingml/2006/picture">
+                  <pic:nvPicPr>
+                    <pic:cNvPr id="109" name="packet_error_flow.png"/>
+                    <pic:cNvPicPr/>
+                  </pic:nvPicPr>
+                  <pic:blipFill>
+                    <a:blip r:embed="rId9"/>
+                    <a:stretch>
+                      <a:fillRect/>
+                    </a:stretch>
+                  </pic:blipFill>
+                  <pic:spPr>
+                    <a:xfrm>
+                      <a:off x="0" y="0"/>
+                      <a:ext cx="5669280" cy="1984248"/>
+                    </a:xfrm>
+                    <a:prstGeom prst="rect">
+                      <a:avLst/>
+                    </a:prstGeom>
+                  </pic:spPr>
+                </pic:pic>
+              </a:graphicData>
+            </a:graphic>
+          </wp:inline>
+        </w:drawing>
+      </w:r>
+    </w:p>
+    <w:p/>
     <w:p/>
     <w:p>
       <w:r>
@@ -674,6 +1196,11 @@
         <w:t xml:space="preserve">Separation of Concerns: keep-alive and watchdog semantics belong to the low-level transport contract; higher-level controller logic should observe the result of that contract rather than implement duplicate link health inference.</w:t>
       </w:r>
     </w:p>
+    <w:p>
+      <w:r>
+        <w:t xml:space="preserve">Design Recommendation: keep the bridge implementation simple. It should never invent host liveness on behalf of the host because that would hide a frozen simulator process.</w:t>
+      </w:r>
+    </w:p>
     <w:p/>
     <w:p>
       <w:r>
@@ -733,6 +1260,65 @@
     </w:p>
     <w:p>
       <w:r>
+        <w:t xml:space="preserve">A low-level transport fault shall always force a transition into the shared error state before higher-level controller logic consumes any additional payload.</w:t>
+      </w:r>
+    </w:p>
+    <w:p>
+      <w:pPr>
+        <w:jc w:val="center"/>
+      </w:pPr>
+      <w:r>
+        <w:rPr>
+          <w:i/>
+        </w:rPr>
+        <w:t xml:space="preserve">Figure 10. Failure modes and recovery overview for CRC faults, watchdog failures, and transport loss.</w:t>
+      </w:r>
+    </w:p>
+    <w:p>
+      <w:pPr>
+        <w:jc w:val="center"/>
+      </w:pPr>
+      <w:r>
+        <w:drawing>
+          <wp:inline distT="0" distB="0" distL="0" distR="0">
+            <wp:extent cx="5669280" cy="3092335"/>
+            <wp:effectExtent l="0" t="0" r="0" b="0"/>
+            <wp:docPr id="110" name="failure_modes_overview.png"/>
+            <wp:cNvGraphicFramePr>
+              <a:graphicFrameLocks xmlns:a="http://schemas.openxmlformats.org/drawingml/2006/main" noChangeAspect="1"/>
+            </wp:cNvGraphicFramePr>
+            <a:graphic xmlns:a="http://schemas.openxmlformats.org/drawingml/2006/main">
+              <a:graphicData uri="http://schemas.openxmlformats.org/drawingml/2006/picture">
+                <pic:pic xmlns:pic="http://schemas.openxmlformats.org/drawingml/2006/picture">
+                  <pic:nvPicPr>
+                    <pic:cNvPr id="110" name="failure_modes_overview.png"/>
+                    <pic:cNvPicPr/>
+                  </pic:nvPicPr>
+                  <pic:blipFill>
+                    <a:blip r:embed="rId10"/>
+                    <a:stretch>
+                      <a:fillRect/>
+                    </a:stretch>
+                  </pic:blipFill>
+                  <pic:spPr>
+                    <a:xfrm>
+                      <a:off x="0" y="0"/>
+                      <a:ext cx="5669280" cy="3092335"/>
+                    </a:xfrm>
+                    <a:prstGeom prst="rect">
+                      <a:avLst/>
+                    </a:prstGeom>
+                  </pic:spPr>
+                </pic:pic>
+              </a:graphicData>
+            </a:graphic>
+          </wp:inline>
+        </w:drawing>
+      </w:r>
+    </w:p>
+    <w:p/>
+    <w:p>
+      <w:r>
         <w:t xml:space="preserve">8.1 CRC Failure</w:t>
       </w:r>
     </w:p>
@@ -888,6 +1474,37 @@
     <w:p>
       <w:r>
         <w:t xml:space="preserve">  error -&gt; initialize with corrected credentials or reset</w:t>
+      </w:r>
+    </w:p>
+    <w:p/>
+    <w:p>
+      <w:r>
+        <w:t xml:space="preserve">8.5A Configured SSID Not Visible During Client Precheck</w:t>
+      </w:r>
+    </w:p>
+    <w:p>
+      <w:r>
+        <w:t xml:space="preserve">Description: the client communication module scans the RF environment during initialize and detects that the configured SSID is not currently visible.</w:t>
+      </w:r>
+    </w:p>
+    <w:p>
+      <w:r>
+        <w:t xml:space="preserve">Diagram:</w:t>
+      </w:r>
+    </w:p>
+    <w:p>
+      <w:r>
+        <w:t xml:space="preserve">  initialize -&gt; ensure Wi-Fi hardware ready -&gt; visibility precheck scan -&gt; configured SSID missing -&gt; error</w:t>
+      </w:r>
+    </w:p>
+    <w:p>
+      <w:r>
+        <w:t xml:space="preserve">Recovery:</w:t>
+      </w:r>
+    </w:p>
+    <w:p>
+      <w:r>
+        <w:t xml:space="preserve">  error -&gt; update credentials or RF environment -&gt; reset -&gt; initialize</w:t>
       </w:r>
     </w:p>
     <w:p/>
@@ -1039,62 +1656,6 @@
       <w:pgSz w:w="12240" w:h="15840"/>
       <w:pgMar w:top="1440" w:right="1440" w:bottom="1440" w:left="1440" w:header="708" w:footer="708" w:gutter="0"/>
     </w:sectPr>
-    <w:p/>
-    <w:p>
-      <w:r>
-        <w:t xml:space="preserve">8. Client Connection Info Device Scan Extension</w:t>
-      </w:r>
-    </w:p>
-    <w:p>
-      <w:r>
-        <w:t xml:space="preserve">Purpose: the Connection Info overlay now exposes a second top-row action named Scan for Devices beside Reset Connection, using the standard two-column button layout already used elsewhere in the project.</w:t>
-      </w:r>
-    </w:p>
-    <w:p>
-      <w:r>
-        <w:t xml:space="preserve">UI Behavior: when the operator presses Scan for Devices, the existing text box is cleared immediately, the overlay switches into scan-results mode, and the communication task owns the discovery workflow without blocking LVGL callbacks.</w:t>
-      </w:r>
-    </w:p>
-    <w:p>
-      <w:r>
-        <w:t xml:space="preserve">Code Ownership: main/ui_screen.c owns button placement, view switching, and text-box refresh behavior; main/CommunicationFunctions.c and main/CommunicationFunctions.h own the scan-state machine, scan request API, and formatted AP result storage.</w:t>
-      </w:r>
-    </w:p>
-    <w:p>
-      <w:r>
-        <w:t xml:space="preserve">Scan State Machine: COMMUNICATION_SCAN_STATE_IDLE -&gt; COMMUNICATION_SCAN_STATE_REQUESTED -&gt; COMMUNICATION_SCAN_STATE_IN_PROGRESS -&gt; COMMUNICATION_SCAN_STATE_COMPLETE, with COMMUNICATION_SCAN_STATE_ERROR as the failure latch.</w:t>
-      </w:r>
-    </w:p>
-    <w:p>
-      <w:r>
-        <w:t xml:space="preserve">Scan Trigger Flow: ui_connection_info_scan_event_cb clears the previous label text, sets the overlay into scan view, calls communication_functions_request_scan(), and relies on the periodic UI heartbeat refresh to show progress and the final list.</w:t>
-      </w:r>
-    </w:p>
-    <w:p>
-      <w:r>
-        <w:t xml:space="preserve">Scan Timing Rule: the scan workflow intentionally keeps the operator-visible discovery window open for 10 seconds before publishing the final AP list.</w:t>
-      </w:r>
-    </w:p>
-    <w:p>
-      <w:r>
-        <w:t xml:space="preserve">Scan Execution Details: communication_functions_request_scan() clears the previous result buffer and queues a request flag. The background task starts a non-blocking esp_wifi_scan_start() request, records scan start time, and after 10 seconds stops the scan, reads AP records, and formats up to ten discovered devices into the shared scan_results buffer.</w:t>
-      </w:r>
-    </w:p>
-    <w:p>
-      <w:r>
-        <w:t xml:space="preserve">Result Presentation: after completion, the text box shows the scan state, discovered device count, fixed scan duration, and one line per discovered AP containing SSID, RSSI, and primary channel. Hidden SSIDs are displayed as &lt;hidden&gt;.</w:t>
-      </w:r>
-    </w:p>
-    <w:p>
-      <w:r>
-        <w:t xml:space="preserve">Failure Handling: if the scan cannot start or the AP list cannot be read back, the main transport state remains unchanged while the scan workflow moves into COMMUNICATION_SCAN_STATE_ERROR and preserves a scan-specific error string for the UI.</w:t>
-      </w:r>
-    </w:p>
-    <w:p>
-      <w:r>
-        <w:t xml:space="preserve">Reset Interaction: pressing Reset Connection clears any in-flight or stale scan view and returns the text box to the normal communication summary.</w:t>
-      </w:r>
-    </w:p>
   </w:body>
 </w:document>
 </file>
</xml_diff>

<commit_message>
Release client error mapping and workspace snapshot v0.2.10
</commit_message>
<xml_diff>
--- a/docs/EyalEspressoDetailedDesign.docx
+++ b/docs/EyalEspressoDetailedDesign.docx
@@ -14,7 +14,7 @@
     </w:p>
     <w:p>
       <w:r>
-        <w:t xml:space="preserve">Project Version Reference: 0.2.8</w:t>
+        <w:t xml:space="preserve">Project Version Reference: 0.2.9</w:t>
       </w:r>
     </w:p>
     <w:p>
@@ -1489,6 +1489,11 @@
     </w:p>
     <w:p>
       <w:r>
+        <w:t xml:space="preserve">Client Error Text: Wi-Fi AP '&lt;ssid&gt;' is offline or not visible.</w:t>
+      </w:r>
+    </w:p>
+    <w:p>
+      <w:r>
         <w:t xml:space="preserve">Diagram:</w:t>
       </w:r>
     </w:p>
@@ -1510,6 +1515,119 @@
     <w:p/>
     <w:p>
       <w:r>
+        <w:t xml:space="preserve">8.5B TCP Server Not Found or Not Listening</w:t>
+      </w:r>
+    </w:p>
+    <w:p>
+      <w:r>
+        <w:t xml:space="preserve">Description: the client has valid Wi-Fi transport, but the configured TCP endpoint cannot be reached as an active listener.</w:t>
+      </w:r>
+    </w:p>
+    <w:p>
+      <w:r>
+        <w:t xml:space="preserve">Client Error Text: TCP server &lt;ip&gt;:&lt;port&gt; not found or not listening (errno=&lt;n&gt;).</w:t>
+      </w:r>
+    </w:p>
+    <w:p>
+      <w:r>
+        <w:t xml:space="preserve">Detection Rule: this wording is used only for socket connect failures that map to refusal, timeout, or host/network unreachable conditions.</w:t>
+      </w:r>
+    </w:p>
+    <w:p>
+      <w:r>
+        <w:t xml:space="preserve">Diagram:</w:t>
+      </w:r>
+    </w:p>
+    <w:p>
+      <w:r>
+        <w:t xml:space="preserve">  initialize -&gt; Wi-Fi has IP -&gt; TCP connect attempt -&gt; listener unreachable/refused -&gt; error</w:t>
+      </w:r>
+    </w:p>
+    <w:p>
+      <w:r>
+        <w:t xml:space="preserve">Recovery:</w:t>
+      </w:r>
+    </w:p>
+    <w:p>
+      <w:r>
+        <w:t xml:space="preserve">  error -&gt; restore server availability or address configuration -&gt; reset -&gt; initialize -&gt; connect</w:t>
+      </w:r>
+    </w:p>
+    <w:p/>
+    <w:p>
+      <w:r>
+        <w:t xml:space="preserve">8.5C COM Port Not Found on the Simulator Host</w:t>
+      </w:r>
+    </w:p>
+    <w:p>
+      <w:r>
+        <w:t xml:space="preserve">Description: this fault exists on the PC simulator or ESP32-C3 bridge side when the USB COM bridge cannot be opened.</w:t>
+      </w:r>
+    </w:p>
+    <w:p>
+      <w:r>
+        <w:t xml:space="preserve">Client Visibility Rule: the ESP32-S3 client must not claim 'COM port not found' unless the simulator bridge protocol explicitly reports that condition over TCP.</w:t>
+      </w:r>
+    </w:p>
+    <w:p>
+      <w:r>
+        <w:t xml:space="preserve">Diagram:</w:t>
+      </w:r>
+    </w:p>
+    <w:p>
+      <w:r>
+        <w:t xml:space="preserve">  PC simulator/bridge initialize -&gt; COM open failure -&gt; bridge-side error -&gt; optional remote status packet -&gt; client-visible specific COM error</w:t>
+      </w:r>
+    </w:p>
+    <w:p>
+      <w:r>
+        <w:t xml:space="preserve">Recovery:</w:t>
+      </w:r>
+    </w:p>
+    <w:p>
+      <w:r>
+        <w:t xml:space="preserve">  restore COM device or bridge configuration -&gt; report explicit remote status -&gt; reset or initialize</w:t>
+      </w:r>
+    </w:p>
+    <w:p/>
+    <w:p>
+      <w:r>
+        <w:t xml:space="preserve">8.5D Generic Unknown Transport Failure</w:t>
+      </w:r>
+    </w:p>
+    <w:p>
+      <w:r>
+        <w:t xml:space="preserve">Description: transport setup fails at a known stage, but the available evidence does not support a more specific diagnosis.</w:t>
+      </w:r>
+    </w:p>
+    <w:p>
+      <w:r>
+        <w:t xml:space="preserve">Client Error Text: &lt;stage&gt; failure: &lt;detail&gt;.</w:t>
+      </w:r>
+    </w:p>
+    <w:p>
+      <w:r>
+        <w:t xml:space="preserve">Diagram:</w:t>
+      </w:r>
+    </w:p>
+    <w:p>
+      <w:r>
+        <w:t xml:space="preserve">  initialize/connect -&gt; stage-specific API failure without specific classification -&gt; error</w:t>
+      </w:r>
+    </w:p>
+    <w:p>
+      <w:r>
+        <w:t xml:space="preserve">Recovery:</w:t>
+      </w:r>
+    </w:p>
+    <w:p>
+      <w:r>
+        <w:t xml:space="preserve">  review stage detail, correct configuration or implementation issue, then reset or initialize</w:t>
+      </w:r>
+    </w:p>
+    <w:p/>
+    <w:p>
+      <w:r>
         <w:t xml:space="preserve">8.6 TCP Session Loss</w:t>
       </w:r>
     </w:p>
@@ -1634,6 +1752,11 @@
     <w:p>
       <w:r>
         <w:t xml:space="preserve">Versioning Method: project version is stored in VERSION using X.Y.Z, where X covers major feature/refactor boundaries, Y covers minor functionality or bug-fix milestones, and Z covers accepted successful build/flash patch releases.</w:t>
+      </w:r>
+    </w:p>
+    <w:p>
+      <w:r>
+        <w:t xml:space="preserve">Current Client Error Mapping: the client now distinguishes between AP-offline/not-visible faults, TCP server/listener availability faults, and generic stage failures. A simulator-host COM-port failure remains a remote-side condition and must be reported by protocol before the client may surface it as a specific COM error.</w:t>
       </w:r>
     </w:p>
     <w:p/>

</xml_diff>

<commit_message>
Version both projects and duplicate background sound helpers
</commit_message>
<xml_diff>
--- a/docs/EyalEspressoDetailedDesign.docx
+++ b/docs/EyalEspressoDetailedDesign.docx
@@ -14,7 +14,7 @@
     </w:p>
     <w:p>
       <w:r>
-        <w:t xml:space="preserve">Project Version Reference: 0.2.9</w:t>
+        <w:t xml:space="preserve">Project Version Reference: 0.2.11</w:t>
       </w:r>
     </w:p>
     <w:p>
@@ -340,7 +340,7 @@
     </w:p>
     <w:p>
       <w:r>
-        <w:t xml:space="preserve">  - run a visibility precheck scan to confirm that the configured target SSID is actually present before calling esp_wifi_connect()</w:t>
+        <w:t xml:space="preserve">  - run a visibility precheck scan to learn whether the configured target SSID is currently present before calling esp_wifi_connect()</w:t>
       </w:r>
     </w:p>
     <w:p>
@@ -627,7 +627,7 @@
     </w:p>
     <w:p>
       <w:r>
-        <w:t xml:space="preserve">  Low-Level Controller -&gt; prepare resources only if the configured SSID is visible</w:t>
+        <w:t xml:space="preserve">  Low-Level Controller -&gt; continue into a bounded 5-second Wi-Fi association retry window even if the SSID is not yet visible</w:t>
       </w:r>
     </w:p>
     <w:p>
@@ -702,7 +702,7 @@
     </w:p>
     <w:p>
       <w:r>
-        <w:t xml:space="preserve">  The ESP32-S3 client communication module now performs lazy Wi-Fi hardware initialization through the shared peripheral manager before reset/connect and scan operations. It also performs a blocking SSID visibility precheck so an unavailable AP is reported as a deterministic communication error instead of causing repeated blind association attempts.</w:t>
+        <w:t xml:space="preserve">  The ESP32-S3 client communication module now performs lazy Wi-Fi hardware initialization through the shared peripheral manager before reset/connect and scan operations. It performs a blocking SSID visibility precheck as advisory input, but still allows a bounded 5-second Wi-Fi association retry window before reporting that the configured AP is unavailable.</w:t>
       </w:r>
     </w:p>
     <w:p/>
@@ -1463,7 +1463,7 @@
     </w:p>
     <w:p>
       <w:r>
-        <w:t xml:space="preserve">  initialize -&gt; Wi-Fi association failure -&gt; error</w:t>
+        <w:t xml:space="preserve">  initialize -&gt; Wi-Fi association timeout after 5 seconds -&gt; error</w:t>
       </w:r>
     </w:p>
     <w:p>
@@ -1489,7 +1489,7 @@
     </w:p>
     <w:p>
       <w:r>
-        <w:t xml:space="preserve">Client Error Text: Wi-Fi AP '&lt;ssid&gt;' is offline or not visible.</w:t>
+        <w:t xml:space="preserve">Client Error Text: Wi-Fi AP '&lt;ssid&gt;' not available after 5000 ms.</w:t>
       </w:r>
     </w:p>
     <w:p>
@@ -1499,7 +1499,7 @@
     </w:p>
     <w:p>
       <w:r>
-        <w:t xml:space="preserve">  initialize -&gt; ensure Wi-Fi hardware ready -&gt; visibility precheck scan -&gt; configured SSID missing -&gt; error</w:t>
+        <w:t xml:space="preserve">  initialize -&gt; ensure Wi-Fi hardware ready -&gt; visibility precheck scan -&gt; bounded 5-second retry window -&gt; configured SSID still unavailable -&gt; error</w:t>
       </w:r>
     </w:p>
     <w:p>

</xml_diff>

<commit_message>
Checkpoint offline init flow before RS485 diagnostics
</commit_message>
<xml_diff>
--- a/docs/EyalEspressoDetailedDesign.docx
+++ b/docs/EyalEspressoDetailedDesign.docx
@@ -14,7 +14,7 @@
     </w:p>
     <w:p>
       <w:r>
-        <w:t xml:space="preserve">Project Version Reference: 0.2.11</w:t>
+        <w:t xml:space="preserve">Project Version Reference: 0.2.14</w:t>
       </w:r>
     </w:p>
     <w:p>
@@ -161,12 +161,78 @@
     <w:p/>
     <w:p>
       <w:r>
-        <w:t xml:space="preserve">3. Planned Low-Level Control State Machine on Both Sides</w:t>
-      </w:r>
-    </w:p>
-    <w:p>
-      <w:r>
-        <w:t xml:space="preserve">A mirrored simple state machine shall exist on the PC-host side logical controller, on the ESP32-C3 transport controller, and on the client-side low-level communication layer.</w:t>
+        <w:t xml:space="preserve">3. Implemented Client State Machines</w:t>
+      </w:r>
+    </w:p>
+    <w:p>
+      <w:r>
+        <w:t xml:space="preserve">3.1 Upper-Level Application State Machine</w:t>
+      </w:r>
+    </w:p>
+    <w:p>
+      <w:r>
+        <w:t xml:space="preserve">The upper-level client workflow is the application-facing state machine owned by main/Eyal_espresso_ESP32_main.c plus main/ui_screen.c.</w:t>
+      </w:r>
+    </w:p>
+    <w:p>
+      <w:r>
+        <w:t xml:space="preserve">Upper-Level States and Stages:</w:t>
+      </w:r>
+    </w:p>
+    <w:p>
+      <w:r>
+        <w:t xml:space="preserve">  boot = hardware init, LVGL init, splash screen, and retained-state restoration</w:t>
+      </w:r>
+    </w:p>
+    <w:p>
+      <w:r>
+        <w:t xml:space="preserve">  startup_mode_select = operator chooses offline or online mode</w:t>
+      </w:r>
+    </w:p>
+    <w:p>
+      <w:r>
+        <w:t xml:space="preserve">  staged_initialization = internal check, RTC, TF card, Wi-Fi baseline, system constants, communication module, controller status, and version compatibility</w:t>
+      </w:r>
+    </w:p>
+    <w:p>
+      <w:r>
+        <w:t xml:space="preserve">  main_ui = tabbed LVGL operator interface with overlays such as Connection Info, Set Clock, and system-information panels</w:t>
+      </w:r>
+    </w:p>
+    <w:p>
+      <w:r>
+        <w:t xml:space="preserve">  upper-level error routing = failed startup stages are never ignored; they are handled by one centralized result policy</w:t>
+      </w:r>
+    </w:p>
+    <w:p>
+      <w:r>
+        <w:t xml:space="preserve">Upper-Level Startup Rule: Online and Offline run the same staged initialization order. Offline does not skip init steps.</w:t>
+      </w:r>
+    </w:p>
+    <w:p>
+      <w:r>
+        <w:t xml:space="preserve">Upper-Level Failure Rule: when offline == false, a failed startup step is an error that routes to the Error screen. When offline == true, the same failure is downgraded to a warning log with detailed step text and startup continues.</w:t>
+      </w:r>
+    </w:p>
+    <w:p>
+      <w:r>
+        <w:t xml:space="preserve">C Try/Catch Equivalent: the client does not use exceptions, so every init-like startup call must return an explicit status and must be processed by the shared startup result handlers in main/Eyal_espresso_ESP32_main.c.</w:t>
+      </w:r>
+    </w:p>
+    <w:p>
+      <w:r>
+        <w:t xml:space="preserve">Upper-Level Rule: this workflow never performs raw CRC validation or framed parsing directly; it consumes only the summarized snapshot produced by the low-level communication module.</w:t>
+      </w:r>
+    </w:p>
+    <w:p/>
+    <w:p>
+      <w:r>
+        <w:t xml:space="preserve">3.2 Implemented Low-Level Communication State Machine</w:t>
+      </w:r>
+    </w:p>
+    <w:p>
+      <w:r>
+        <w:t xml:space="preserve">The current client low-level communication module is implemented in main/CommunicationFunctions.c and mirrors the server-side transport sequence.</w:t>
       </w:r>
     </w:p>
     <w:p>
@@ -176,67 +242,72 @@
     </w:p>
     <w:p>
       <w:r>
-        <w:t xml:space="preserve">  reset       = perform true reset, clear session state, run self-test, and load connection parameters</w:t>
-      </w:r>
-    </w:p>
-    <w:p>
-      <w:r>
-        <w:t xml:space="preserve">  initialize  = validate configuration produced by reset and prepare the low-level link</w:t>
-      </w:r>
-    </w:p>
-    <w:p>
-      <w:r>
-        <w:t xml:space="preserve">  connect     = establish or maintain a single low-level server/client session</w:t>
-      </w:r>
-    </w:p>
-    <w:p>
-      <w:r>
-        <w:t xml:space="preserve">  disconnect  = perform controlled shutdown of the low-level session</w:t>
-      </w:r>
-    </w:p>
-    <w:p>
-      <w:r>
-        <w:t xml:space="preserve">  error       = latched fault state entered after timeout, CRC fault, malformed frame, or transport failure</w:t>
-      </w:r>
-    </w:p>
-    <w:p>
-      <w:r>
-        <w:t xml:space="preserve">Primary State Diagram:</w:t>
-      </w:r>
-    </w:p>
-    <w:p>
-      <w:r>
-        <w:t xml:space="preserve">  reset -&gt; initialize -&gt; connect</w:t>
-      </w:r>
-    </w:p>
-    <w:p>
-      <w:r>
-        <w:t xml:space="preserve">  connect -&gt; disconnect</w:t>
-      </w:r>
-    </w:p>
-    <w:p>
-      <w:r>
-        <w:t xml:space="preserve">  connect -&gt; error</w:t>
-      </w:r>
-    </w:p>
-    <w:p>
-      <w:r>
-        <w:t xml:space="preserve">  initialize -&gt; error</w:t>
-      </w:r>
-    </w:p>
-    <w:p>
-      <w:r>
-        <w:t xml:space="preserve">  disconnect -&gt; reset</w:t>
+        <w:t xml:space="preserve">  reset = clear framed transport bookkeeping, close the TCP socket, disconnect Wi-Fi if needed, and arm a fresh initialize attempt</w:t>
+      </w:r>
+    </w:p>
+    <w:p>
+      <w:r>
+        <w:t xml:space="preserve">  initialize = ensure the Wi-Fi stack exists, load SSID/password/IP/port defaults, run the advisory visibility scan, and wait for the STA interface to obtain an IP address</w:t>
+      </w:r>
+    </w:p>
+    <w:p>
+      <w:r>
+        <w:t xml:space="preserve">  connect = open the TCP socket to 192.168.4.1:3333, send INITIALIZE and CONNECT frames, and wait for client_connected or equivalent connect success</w:t>
+      </w:r>
+    </w:p>
+    <w:p>
+      <w:r>
+        <w:t xml:space="preserve">  keepalive = send framed keepalive messages every configured period and supervise liveness/ACK timing</w:t>
+      </w:r>
+    </w:p>
+    <w:p>
+      <w:r>
+        <w:t xml:space="preserve">  send_data = allow application payload transmission while the same keepalive supervision remains healthy</w:t>
+      </w:r>
+    </w:p>
+    <w:p>
+      <w:r>
+        <w:t xml:space="preserve">  error = latch the last fault reason and wait for reset-driven recovery</w:t>
+      </w:r>
+    </w:p>
+    <w:p>
+      <w:r>
+        <w:t xml:space="preserve">Primary Implemented State Diagram:</w:t>
+      </w:r>
+    </w:p>
+    <w:p>
+      <w:r>
+        <w:t xml:space="preserve">  reset -&gt; initialize -&gt; connect -&gt; keepalive -&gt; send_data</w:t>
+      </w:r>
+    </w:p>
+    <w:p>
+      <w:r>
+        <w:t xml:space="preserve">  send_data -&gt; keepalive when the session returns to heartbeat-only supervision</w:t>
+      </w:r>
+    </w:p>
+    <w:p>
+      <w:r>
+        <w:t xml:space="preserve">  initialize -&gt; error on Wi-Fi timeout or TCP setup failure</w:t>
+      </w:r>
+    </w:p>
+    <w:p>
+      <w:r>
+        <w:t xml:space="preserve">  connect -&gt; error on response timeout or transport loss</w:t>
+      </w:r>
+    </w:p>
+    <w:p>
+      <w:r>
+        <w:t xml:space="preserve">  keepalive -&gt; error on watchdog timeout, malformed frame, or transport loss</w:t>
+      </w:r>
+    </w:p>
+    <w:p>
+      <w:r>
+        <w:t xml:space="preserve">  send_data -&gt; error on watchdog timeout, malformed frame, or transport loss</w:t>
       </w:r>
     </w:p>
     <w:p>
       <w:r>
         <w:t xml:space="preserve">  error -&gt; reset</w:t>
-      </w:r>
-    </w:p>
-    <w:p>
-      <w:r>
-        <w:t xml:space="preserve">  error -&gt; initialize</w:t>
       </w:r>
     </w:p>
     <w:p>
@@ -300,22 +371,17 @@
     </w:p>
     <w:p>
       <w:r>
-        <w:t xml:space="preserve">  - clear transport counters, watchdog timers, and partial frame buffers</w:t>
-      </w:r>
-    </w:p>
-    <w:p>
-      <w:r>
-        <w:t xml:space="preserve">  - clear stale TCP socket ownership and stale USB session ownership</w:t>
-      </w:r>
-    </w:p>
-    <w:p>
-      <w:r>
-        <w:t xml:space="preserve">  - run a low-level self-test</w:t>
-      </w:r>
-    </w:p>
-    <w:p>
-      <w:r>
-        <w:t xml:space="preserve">  - apply parameters that define the target connection role and transport settings</w:t>
+        <w:t xml:space="preserve">  - clear host_live_integer, device_live_integer, live_integer, sequence, and partial RX-buffer state</w:t>
+      </w:r>
+    </w:p>
+    <w:p>
+      <w:r>
+        <w:t xml:space="preserve">  - close the active TCP socket and clear tcp_connected</w:t>
+      </w:r>
+    </w:p>
+    <w:p>
+      <w:r>
+        <w:t xml:space="preserve">  - disconnect the STA session so the next initialize cycle is deterministic</w:t>
       </w:r>
     </w:p>
     <w:p>
@@ -325,27 +391,22 @@
     </w:p>
     <w:p>
       <w:r>
-        <w:t xml:space="preserve">  - confirm that the reset parameters are internally consistent</w:t>
-      </w:r>
-    </w:p>
-    <w:p>
-      <w:r>
-        <w:t xml:space="preserve">  - ensure that the Wi-Fi hardware and ESP-IDF driver stack are ready before association work begins</w:t>
-      </w:r>
-    </w:p>
-    <w:p>
-      <w:r>
-        <w:t xml:space="preserve">  - prepare Wi-Fi credentials, host/client role, port numbers, and watchdog timing</w:t>
-      </w:r>
-    </w:p>
-    <w:p>
-      <w:r>
-        <w:t xml:space="preserve">  - run a visibility precheck scan to learn whether the configured target SSID is currently present before calling esp_wifi_connect()</w:t>
-      </w:r>
-    </w:p>
-    <w:p>
-      <w:r>
-        <w:t xml:space="preserve">  - prepare packet parser state without claiming that the link is yet healthy</w:t>
+        <w:t xml:space="preserve">  - ensure the Wi-Fi driver and netif stack are available</w:t>
+      </w:r>
+    </w:p>
+    <w:p>
+      <w:r>
+        <w:t xml:space="preserve">  - apply SSID/password/server constants from the active snapshot config</w:t>
+      </w:r>
+    </w:p>
+    <w:p>
+      <w:r>
+        <w:t xml:space="preserve">  - run the advisory AP visibility scan</w:t>
+      </w:r>
+    </w:p>
+    <w:p>
+      <w:r>
+        <w:t xml:space="preserve">  - keep trying association within the configured timeout window instead of failing immediately on one scan result</w:t>
       </w:r>
     </w:p>
     <w:p>
@@ -355,42 +416,37 @@
     </w:p>
     <w:p>
       <w:r>
-        <w:t xml:space="preserve">  - establish the low-level link</w:t>
-      </w:r>
-    </w:p>
-    <w:p>
-      <w:r>
-        <w:t xml:space="preserve">  - enforce 100 mSec keep-alive cadence</w:t>
-      </w:r>
-    </w:p>
-    <w:p>
-      <w:r>
-        <w:t xml:space="preserve">  - validate CRC before passing any payload upward</w:t>
-      </w:r>
-    </w:p>
-    <w:p>
-      <w:r>
-        <w:t xml:space="preserve">  - increment or validate liveness counters according to ownership rules</w:t>
-      </w:r>
-    </w:p>
-    <w:p>
-      <w:r>
-        <w:t xml:space="preserve">Disconnect State Responsibilities:</w:t>
-      </w:r>
-    </w:p>
-    <w:p>
-      <w:r>
-        <w:t xml:space="preserve">  - send or log a controlled disconnect reason</w:t>
-      </w:r>
-    </w:p>
-    <w:p>
-      <w:r>
-        <w:t xml:space="preserve">  - close sockets cleanly</w:t>
-      </w:r>
-    </w:p>
-    <w:p>
-      <w:r>
-        <w:t xml:space="preserve">  - release low-level resources</w:t>
+        <w:t xml:space="preserve">  - create the TCP socket and connect to the configured server endpoint</w:t>
+      </w:r>
+    </w:p>
+    <w:p>
+      <w:r>
+        <w:t xml:space="preserve">  - serialize and send the framed INITIALIZE payload followed by framed CONNECT</w:t>
+      </w:r>
+    </w:p>
+    <w:p>
+      <w:r>
+        <w:t xml:space="preserve">  - wait for a valid framed response that proves the bridge/client session is ready</w:t>
+      </w:r>
+    </w:p>
+    <w:p>
+      <w:r>
+        <w:t xml:space="preserve">Keepalive and Send-Data Responsibilities:</w:t>
+      </w:r>
+    </w:p>
+    <w:p>
+      <w:r>
+        <w:t xml:space="preserve">  - increment host_live_integer on each keepalive period</w:t>
+      </w:r>
+    </w:p>
+    <w:p>
+      <w:r>
+        <w:t xml:space="preserve">  - preserve the latest device_live_integer returned by the peer</w:t>
+      </w:r>
+    </w:p>
+    <w:p>
+      <w:r>
+        <w:t xml:space="preserve">  - reject stale or malformed framed traffic before any upper-level code consumes payload</w:t>
       </w:r>
     </w:p>
     <w:p>
@@ -400,103 +456,108 @@
     </w:p>
     <w:p>
       <w:r>
-        <w:t xml:space="preserve">  - stop forwarding application payloads upward</w:t>
-      </w:r>
-    </w:p>
-    <w:p>
-      <w:r>
-        <w:t xml:space="preserve">  - preserve the last known error cause</w:t>
-      </w:r>
-    </w:p>
-    <w:p>
-      <w:r>
-        <w:t xml:space="preserve">  - wait only for explicit reset or initialize commands from the upper layer</w:t>
-      </w:r>
-    </w:p>
-    <w:p/>
-    <w:p>
-      <w:r>
-        <w:t xml:space="preserve">4. Low-Level Packet Envelope and Data Model</w:t>
-      </w:r>
-    </w:p>
-    <w:p>
-      <w:r>
-        <w:t xml:space="preserve">Recommendation: use one standard low-level frame envelope with multiple message types, not one giant monolithic full-state packet for every exchange.</w:t>
-      </w:r>
-    </w:p>
-    <w:p>
-      <w:r>
-        <w:t xml:space="preserve">Reasoning: a single envelope guarantees consistency for CRC, framing, counters, and parsing, while multiple message types keep the protocol debuggable, low-latency, and extensible.</w:t>
-      </w:r>
-    </w:p>
-    <w:p>
-      <w:r>
-        <w:t xml:space="preserve">Recommended Envelope Fields:</w:t>
-      </w:r>
-    </w:p>
-    <w:p>
-      <w:r>
-        <w:t xml:space="preserve">  SOF               = fixed start-of-frame marker</w:t>
-      </w:r>
-    </w:p>
-    <w:p>
-      <w:r>
-        <w:t xml:space="preserve">  protocol_version  = low-level framing version</w:t>
-      </w:r>
-    </w:p>
-    <w:p>
-      <w:r>
-        <w:t xml:space="preserve">  message_type      = RESET, INITIALIZE, CONNECT, DISCONNECT, KEEPALIVE, DATA, ERROR, ACK</w:t>
-      </w:r>
-    </w:p>
-    <w:p>
-      <w:r>
-        <w:t xml:space="preserve">  flags             = optional control bits</w:t>
-      </w:r>
-    </w:p>
-    <w:p>
-      <w:r>
-        <w:t xml:space="preserve">  payload_length    = payload size in bytes</w:t>
-      </w:r>
-    </w:p>
-    <w:p>
-      <w:r>
-        <w:t xml:space="preserve">  host_live_integer = authoritative host-side liveness counter</w:t>
-      </w:r>
-    </w:p>
-    <w:p>
-      <w:r>
-        <w:t xml:space="preserve">  device_live_integer = optional device-side liveness counter returned by the controller</w:t>
-      </w:r>
-    </w:p>
-    <w:p>
-      <w:r>
-        <w:t xml:space="preserve">  sequence          = frame sequence for duplicate/missing-frame detection</w:t>
-      </w:r>
-    </w:p>
-    <w:p>
-      <w:r>
-        <w:t xml:space="preserve">  payload           = message-specific payload</w:t>
-      </w:r>
-    </w:p>
-    <w:p>
-      <w:r>
-        <w:t xml:space="preserve">  crc               = CRC16 or CRC32 over the protected frame bytes</w:t>
-      </w:r>
-    </w:p>
-    <w:p>
-      <w:r>
-        <w:t xml:space="preserve">CRC Guidance: checksum or CRC belongs to the low-level framing layer so the upper-level controller state machine can assume that every payload it receives has already passed integrity validation.</w:t>
-      </w:r>
-    </w:p>
-    <w:p>
-      <w:r>
-        <w:t xml:space="preserve">Counter Ownership Recommendation: the authoritative HostLiveInteger should be incremented by the upper-level host so the transport controller can detect that the host itself is not stuck. The transport controller may also publish its own DeviceLiveInteger so liveness can be checked in both directions.</w:t>
-      </w:r>
-    </w:p>
-    <w:p>
-      <w:r>
-        <w:t xml:space="preserve">Keep-Alive Recommendation: do not rely on generic data packets as proof of link health. Use a dedicated keep-alive packet every 100 mSec even when no application payload has changed.</w:t>
+        <w:t xml:space="preserve">  - preserve last_error for UI visibility</w:t>
+      </w:r>
+    </w:p>
+    <w:p>
+      <w:r>
+        <w:t xml:space="preserve">  - stop using the transport path until reset is requested</w:t>
+      </w:r>
+    </w:p>
+    <w:p/>
+    <w:p>
+      <w:r>
+        <w:t xml:space="preserve">4. Implemented Low-Level Packet Envelope and Data Model</w:t>
+      </w:r>
+    </w:p>
+    <w:p>
+      <w:r>
+        <w:t xml:space="preserve">The current implementation uses one explicit binary frame envelope for RESET, INITIALIZE, CONNECT, KEEPALIVE, DATA, ERROR, and ACK traffic.</w:t>
+      </w:r>
+    </w:p>
+    <w:p>
+      <w:r>
+        <w:t xml:space="preserve">Implemented Frame Layout in Byte Order:</w:t>
+      </w:r>
+    </w:p>
+    <w:p>
+      <w:r>
+        <w:t xml:space="preserve">  bytes 0..1   = SOF = 0xA5 0x5A</w:t>
+      </w:r>
+    </w:p>
+    <w:p>
+      <w:r>
+        <w:t xml:space="preserve">  byte 2       = message_type</w:t>
+      </w:r>
+    </w:p>
+    <w:p>
+      <w:r>
+        <w:t xml:space="preserve">  bytes 3..4   = payload_length as little-endian uint16</w:t>
+      </w:r>
+    </w:p>
+    <w:p>
+      <w:r>
+        <w:t xml:space="preserve">  bytes 5..8   = host_live_integer as little-endian uint32</w:t>
+      </w:r>
+    </w:p>
+    <w:p>
+      <w:r>
+        <w:t xml:space="preserve">  bytes 9..12  = device_live_integer as little-endian uint32</w:t>
+      </w:r>
+    </w:p>
+    <w:p>
+      <w:r>
+        <w:t xml:space="preserve">  bytes 13..14 = sequence as little-endian uint16</w:t>
+      </w:r>
+    </w:p>
+    <w:p>
+      <w:r>
+        <w:t xml:space="preserve">  bytes 15..N  = payload bytes</w:t>
+      </w:r>
+    </w:p>
+    <w:p>
+      <w:r>
+        <w:t xml:space="preserve">  final 2 bytes = CRC16-CCITT over every prior frame byte</w:t>
+      </w:r>
+    </w:p>
+    <w:p>
+      <w:r>
+        <w:t xml:space="preserve">Implemented Limits and Construction Rules:</w:t>
+      </w:r>
+    </w:p>
+    <w:p>
+      <w:r>
+        <w:t xml:space="preserve">  - the client currently builds payloads up to COMMUNICATION_FRAME_MAX_PAYLOAD</w:t>
+      </w:r>
+    </w:p>
+    <w:p>
+      <w:r>
+        <w:t xml:space="preserve">  - the sender computes CRC after the header plus payload bytes are fully populated</w:t>
+      </w:r>
+    </w:p>
+    <w:p>
+      <w:r>
+        <w:t xml:space="preserve">  - the receiver validates SOF, validates payload length against the configured maximum, validates CRC, and only then interprets message_type and payload</w:t>
+      </w:r>
+    </w:p>
+    <w:p>
+      <w:r>
+        <w:t xml:space="preserve">  - integers are serialized little-endian on both sides</w:t>
+      </w:r>
+    </w:p>
+    <w:p>
+      <w:r>
+        <w:t xml:space="preserve">CRC Guidance: integrity belongs entirely to this low-level frame layer so the upper-level state machine can trust any payload it receives from the low-level module.</w:t>
+      </w:r>
+    </w:p>
+    <w:p>
+      <w:r>
+        <w:t xml:space="preserve">Counter Ownership Recommendation: the client increments host_live_integer when it sends KEEPALIVE. The peer returns device_live_integer, and both counters are exposed to the UI snapshot so liveness can be reviewed visually.</w:t>
+      </w:r>
+    </w:p>
+    <w:p>
+      <w:r>
+        <w:t xml:space="preserve">Keep-Alive Recommendation: do not rely on generic DATA packets as proof of health. The current implementation uses dedicated KEEPALIVE traffic every 100 mSec by default.</w:t>
       </w:r>
     </w:p>
     <w:p/>
@@ -1264,6 +1325,11 @@
       </w:r>
     </w:p>
     <w:p>
+      <w:r>
+        <w:t xml:space="preserve">Startup Failure Classification Rule: staged initialization failures are classified by startup mode rather than by a separate offline sequence. Online startup escalates to the Error screen; Offline startup logs warnings and continues.</w:t>
+      </w:r>
+    </w:p>
+    <w:p>
       <w:pPr>
         <w:jc w:val="center"/>
       </w:pPr>

</xml_diff>

<commit_message>
release: 0.2.21 keepalive split, fast reset path, and docs sync
</commit_message>
<xml_diff>
--- a/docs/EyalEspressoDetailedDesign.docx
+++ b/docs/EyalEspressoDetailedDesign.docx
@@ -14,7 +14,7 @@
     </w:p>
     <w:p>
       <w:r>
-        <w:t xml:space="preserve">Project Version Reference: 0.2.14</w:t>
+        <w:t xml:space="preserve">Project Version Reference: 0.2.18</w:t>
       </w:r>
     </w:p>
     <w:p>
@@ -1313,6 +1313,61 @@
         <w:t xml:space="preserve">Planned Code Ownership: the client repository should isolate this low-level communication behavior inside a dedicated transport-oriented module rather than spreading watchdog and CRC checks across unrelated UI files.</w:t>
       </w:r>
     </w:p>
+    <w:p>
+      <w:r>
+        <w:t xml:space="preserve">Two-Layer Connection Design (Implemented):</w:t>
+      </w:r>
+    </w:p>
+    <w:p>
+      <w:r>
+        <w:t xml:space="preserve">  TopLayer states: reset -&gt; initialize -&gt; connect -&gt; keepalive -&gt; error</w:t>
+      </w:r>
+    </w:p>
+    <w:p>
+      <w:r>
+        <w:t xml:space="preserve">  BottomLayer responsibilities: Wi-Fi/TCP auto-connect, checksum (CRC) validation, and up to 3 retries on link loss or checksum failure</w:t>
+      </w:r>
+    </w:p>
+    <w:p>
+      <w:r>
+        <w:t xml:space="preserve">  TopLayer responsibilities: sequential liveness supervision, async freeze detection, and transition to error when failures require explicit reset</w:t>
+      </w:r>
+    </w:p>
+    <w:p>
+      <w:r>
+        <w:t xml:space="preserve">  KeepAlive Gate Rule: both sides must complete 3 sequential live exchanges in connect before entering keepalive.</w:t>
+      </w:r>
+    </w:p>
+    <w:p>
+      <w:r>
+        <w:t xml:space="preserve">Design Diagram Source:</w:t>
+      </w:r>
+    </w:p>
+    <w:p>
+      <w:r>
+        <w:t xml:space="preserve">  docs/architecture/top_bottom_layer_state_machine.mmd</w:t>
+      </w:r>
+    </w:p>
+    <w:p>
+      <w:r>
+        <w:t xml:space="preserve">Diagram:</w:t>
+      </w:r>
+    </w:p>
+    <w:p>
+      <w:r>
+        <w:t xml:space="preserve">  TopLayerReset -&gt; TopLayerInitialize -&gt; TopLayerConnect -&gt; TopLayerKeepAlive</w:t>
+      </w:r>
+    </w:p>
+    <w:p>
+      <w:r>
+        <w:t xml:space="preserve">  TopLayerConnect -&gt; TopLayerError when BottomLayerRetries == 3 OR TopLayerFailures == 3</w:t>
+      </w:r>
+    </w:p>
+    <w:p>
+      <w:r>
+        <w:t xml:space="preserve">  TopLayerError -&gt; TopLayerReset only by explicit operator reset</w:t>
+      </w:r>
+    </w:p>
     <w:p/>
     <w:p>
       <w:r>

</xml_diff>

<commit_message>
docs: update detailed design for v0.3.1 - owner Claude, revision history, frame limits
Co-Authored-By: Claude Sonnet 4.6 <noreply@anthropic.com>
</commit_message>
<xml_diff>
--- a/docs/EyalEspressoDetailedDesign.docx
+++ b/docs/EyalEspressoDetailedDesign.docx
@@ -14,12 +14,43 @@
     </w:p>
     <w:p>
       <w:r>
-        <w:t xml:space="preserve">Project Version Reference: 0.2.18</w:t>
-      </w:r>
-    </w:p>
-    <w:p>
-      <w:r>
-        <w:t xml:space="preserve">Owner: Eyal / Codex</w:t>
+        <w:t xml:space="preserve">Project Version Reference: 0.3.1</w:t>
+      </w:r>
+    </w:p>
+    <w:p>
+      <w:r>
+        <w:t xml:space="preserve">Owner: Eyal / Claude</w:t>
+      </w:r>
+    </w:p>
+    <w:p/>
+    <w:p>
+      <w:r>
+        <w:t xml:space="preserve">Revision History</w:t>
+      </w:r>
+    </w:p>
+    <w:p>
+      <w:r>
+        <w:t xml:space="preserve">v0.3.1 - First working version with CLAUDE</w:t>
+      </w:r>
+    </w:p>
+    <w:p>
+      <w:r>
+        <w:t xml:space="preserve">  - Fixed INITIALIZE payload: added required data_ver=1 field (bridge rejects without it)</w:t>
+      </w:r>
+    </w:p>
+    <w:p>
+      <w:r>
+        <w:t xml:space="preserve">  - Fixed KEEPALIVE response payload: added required rver=1 field (bridge rejects without it)</w:t>
+      </w:r>
+    </w:p>
+    <w:p>
+      <w:r>
+        <w:t xml:space="preserve">  - Raised COMMUNICATION_FRAME_MAX_PAYLOAD from 160 to 256 bytes to accept 170-byte binary DATA frames from bridge</w:t>
+      </w:r>
+    </w:p>
+    <w:p>
+      <w:r>
+        <w:t xml:space="preserve">  - Transport now sustains RESET -&gt; INITIALIZE -&gt; CONNECT -&gt; KEEPALIVE_SERVER_RECEIVE - KEEPALIVE_CLIENT_SEND continuously</w:t>
       </w:r>
     </w:p>
     <w:p/>
@@ -527,7 +558,7 @@
     </w:p>
     <w:p>
       <w:r>
-        <w:t xml:space="preserve">  - the client currently builds payloads up to COMMUNICATION_FRAME_MAX_PAYLOAD</w:t>
+        <w:t xml:space="preserve">  - the client currently builds payloads up to COMMUNICATION_FRAME_MAX_PAYLOAD (256 bytes, matching bridge BRIDGE_FRAME_MAX_PAYLOAD)</w:t>
       </w:r>
     </w:p>
     <w:p>
@@ -1234,22 +1265,22 @@
     </w:p>
     <w:p>
       <w:r>
-        <w:t xml:space="preserve">Heartbeat Cadence: keep-alive packets shall be generated every 100 mSec even when no new application payload exists.</w:t>
-      </w:r>
-    </w:p>
-    <w:p>
-      <w:r>
-        <w:t xml:space="preserve">Host Responsibility: the host-side layer must increment HostLiveInteger every heartbeat period to prove that the upper-level simulator or controller is alive and not stalled.</w:t>
-      </w:r>
-    </w:p>
-    <w:p>
-      <w:r>
-        <w:t xml:space="preserve">Device Responsibility: the low-level transport controller should answer every heartbeat period with transport status and an optional DeviceLiveInteger so liveness is visible in both directions.</w:t>
-      </w:r>
-    </w:p>
-    <w:p>
-      <w:r>
-        <w:t xml:space="preserve">Watchdog Trigger: if the expected counter does not advance within the watchdog window, the receiving side shall stop treating the link as healthy and move to error.</w:t>
+        <w:t xml:space="preserve">Heartbeat Cadence: bridge-originated keep-alive requests are generated every 300 mSec when the session is healthy.</w:t>
+      </w:r>
+    </w:p>
+    <w:p>
+      <w:r>
+        <w:t xml:space="preserve">Server Responsibility: the ESP32-C3 side sends authoritative even ServerLiveInteger values and owns keepalive request timing.</w:t>
+      </w:r>
+    </w:p>
+    <w:p>
+      <w:r>
+        <w:t xml:space="preserve">Client Responsibility: the ESP32-S3 client validates each server request and sends exactly one odd ClientLiveInteger response.</w:t>
+      </w:r>
+    </w:p>
+    <w:p>
+      <w:r>
+        <w:t xml:space="preserve">Watchdog Trigger: if the expected keepalive progress does not arrive within the 450 mSec response window, the receiving side increments timeout counters and schedules retry escalation.</w:t>
       </w:r>
     </w:p>
     <w:p>
@@ -1320,7 +1351,7 @@
     </w:p>
     <w:p>
       <w:r>
-        <w:t xml:space="preserve">  TopLayer states: reset -&gt; initialize -&gt; connect -&gt; keepalive -&gt; error</w:t>
+        <w:t xml:space="preserve">  TopLayer states: reset -&gt; initialize -&gt; connect -&gt; keepalive_server_receive &lt;-&gt; keepalive_client_send -&gt; error</w:t>
       </w:r>
     </w:p>
     <w:p>
@@ -1335,7 +1366,7 @@
     </w:p>
     <w:p>
       <w:r>
-        <w:t xml:space="preserve">  KeepAlive Gate Rule: both sides must complete 3 sequential live exchanges in connect before entering keepalive.</w:t>
+        <w:t xml:space="preserve">  KeepAlive Rule: connect completion moves to KeepAliveServerReceive, and each cycle alternates one server request and one client response.</w:t>
       </w:r>
     </w:p>
     <w:p>
@@ -1355,7 +1386,7 @@
     </w:p>
     <w:p>
       <w:r>
-        <w:t xml:space="preserve">  TopLayerReset -&gt; TopLayerInitialize -&gt; TopLayerConnect -&gt; TopLayerKeepAlive</w:t>
+        <w:t xml:space="preserve">  TopLayerReset -&gt; TopLayerInitialize -&gt; TopLayerConnect -&gt; TopLayerKeepAliveServerReceive -&gt; TopLayerKeepAliveClientSend</w:t>
       </w:r>
     </w:p>
     <w:p>

</xml_diff>

<commit_message>
release: bump to 0.3.7 with simulate-data and COM-release updates
</commit_message>
<xml_diff>
--- a/docs/EyalEspressoDetailedDesign.docx
+++ b/docs/EyalEspressoDetailedDesign.docx
@@ -14,7 +14,7 @@
     </w:p>
     <w:p>
       <w:r>
-        <w:t xml:space="preserve">Project Version Reference: 0.3.1</w:t>
+        <w:t xml:space="preserve">Project Version Reference: 0.3.6</w:t>
       </w:r>
     </w:p>
     <w:p>
@@ -51,6 +51,31 @@
     <w:p>
       <w:r>
         <w:t xml:space="preserve">  - Transport now sustains RESET -&gt; INITIALIZE -&gt; CONNECT -&gt; KEEPALIVE_SERVER_RECEIVE - KEEPALIVE_CLIENT_SEND continuously</w:t>
+      </w:r>
+    </w:p>
+    <w:p>
+      <w:r>
+        <w:t xml:space="preserve">v0.3.6 - DATA path refresh and deterministic Simulate Data plotting</w:t>
+      </w:r>
+    </w:p>
+    <w:p>
+      <w:r>
+        <w:t xml:space="preserve">  - Client downlink FIFO depth increased to 64 packets</w:t>
+      </w:r>
+    </w:p>
+    <w:p>
+      <w:r>
+        <w:t xml:space="preserve">  - FIFO full behavior changed from drop to wait (delay/back-pressure over client-side data loss)</w:t>
+      </w:r>
+    </w:p>
+    <w:p>
+      <w:r>
+        <w:t xml:space="preserve">  - Simulate Data UI poll period reduced from 100 mSec to 20 mSec</w:t>
+      </w:r>
+    </w:p>
+    <w:p>
+      <w:r>
+        <w:t xml:space="preserve">  - Simulate Data UI now consumes one packet per poll tick to preserve FIFO order and avoid burst-collapse rendering</w:t>
       </w:r>
     </w:p>
     <w:p/>
@@ -1100,7 +1125,22 @@
     </w:p>
     <w:p>
       <w:r>
-        <w:t xml:space="preserve">  Low-Level Controller -&gt; forward payload over TCP</w:t>
+        <w:t xml:space="preserve">  Low-Level Controller -&gt; enqueue validated downlink payload into client DATA FIFO</w:t>
+      </w:r>
+    </w:p>
+    <w:p>
+      <w:r>
+        <w:t xml:space="preserve">  FIFO policy -&gt; if full, enqueue waits for space (delay/back-pressure), no client-side drop at FIFO boundary</w:t>
+      </w:r>
+    </w:p>
+    <w:p>
+      <w:r>
+        <w:t xml:space="preserve">  UI path -&gt; poll every 20 mSec and consume one packet per tick in FIFO order</w:t>
+      </w:r>
+    </w:p>
+    <w:p>
+      <w:r>
+        <w:t xml:space="preserve">  UI path -&gt; update Simulate Data graph once per consumed packet</w:t>
       </w:r>
     </w:p>
     <w:p>
@@ -1110,7 +1150,7 @@
     </w:p>
     <w:p>
       <w:r>
-        <w:t xml:space="preserve">  Upper Layer -&gt; consume payload only after low-level validation</w:t>
+        <w:t xml:space="preserve">  Upper Layer -&gt; consume payload only after low-level validation and FIFO ordering</w:t>
       </w:r>
     </w:p>
     <w:p>
@@ -1170,6 +1210,72 @@
     <w:p/>
     <w:p>
       <w:r>
+        <w:t xml:space="preserve">5.6A Implemented Client DATA Path (Simulate Data)</w:t>
+      </w:r>
+    </w:p>
+    <w:p>
+      <w:r>
+        <w:t xml:space="preserve">Implemented Packet Source:</w:t>
+      </w:r>
+    </w:p>
+    <w:p>
+      <w:r>
+        <w:t xml:space="preserve">  Simulator sends one binary downlink packet at 100 mSec intervals when DataSimulation is enabled.</w:t>
+      </w:r>
+    </w:p>
+    <w:p>
+      <w:r>
+        <w:t xml:space="preserve">Implemented Packet Shape:</w:t>
+      </w:r>
+    </w:p>
+    <w:p>
+      <w:r>
+        <w:t xml:space="preserve">  magic(0xD0), seq(uint32), 100 floats, 20 ints, 50-byte string.</w:t>
+      </w:r>
+    </w:p>
+    <w:p>
+      <w:r>
+        <w:t xml:space="preserve">Implemented Buffering and Rendering Chain:</w:t>
+      </w:r>
+    </w:p>
+    <w:p>
+      <w:r>
+        <w:t xml:space="preserve">  CommunicationFunctions RX -&gt; data_downlink_push() -&gt; downlink FIFO (depth 64) -&gt; ui_sim_data_poll_timer_cb() -&gt; data_downlink_pop() -&gt; ui_plot_sim_data_packet().</w:t>
+      </w:r>
+    </w:p>
+    <w:p>
+      <w:r>
+        <w:t xml:space="preserve">Determinism Rule:</w:t>
+      </w:r>
+    </w:p>
+    <w:p>
+      <w:r>
+        <w:t xml:space="preserve">  The UI pops one packet per 20 mSec tick, preserving FIFO order and avoiding visual collapse of multiple arrivals into one redraw.</w:t>
+      </w:r>
+    </w:p>
+    <w:p>
+      <w:r>
+        <w:t xml:space="preserve">Loss vs Delay Rule:</w:t>
+      </w:r>
+    </w:p>
+    <w:p>
+      <w:r>
+        <w:t xml:space="preserve">  At the client FIFO boundary, overload is represented as queueing delay rather than packet drop.</w:t>
+      </w:r>
+    </w:p>
+    <w:p>
+      <w:r>
+        <w:t xml:space="preserve">Observed Tradeoff:</w:t>
+      </w:r>
+    </w:p>
+    <w:p>
+      <w:r>
+        <w:t xml:space="preserve">  Under prolonged overload, latency can grow because producer enqueue waits for available FIFO slots.</w:t>
+      </w:r>
+    </w:p>
+    <w:p/>
+    <w:p>
+      <w:r>
         <w:t xml:space="preserve">5.7 ERROR Packet</w:t>
       </w:r>
     </w:p>

</xml_diff>